<commit_message>
Evidencia de Aprendizaje JDBC- Completada
</commit_message>
<xml_diff>
--- a/EVIDENCIA DE APRENDIZAJE.docx
+++ b/EVIDENCIA DE APRENDIZAJE.docx
@@ -10474,6 +10474,7 @@
       <w:r>
         <w:rPr>
           <w:rFonts w:ascii="Arial" w:hAnsi="Arial" w:cs="Arial"/>
+          <w:noProof/>
         </w:rPr>
         <w:drawing>
           <wp:inline distT="0" distB="0" distL="0" distR="0" wp14:anchorId="5DD78D76" wp14:editId="2BF9B3BD">
@@ -10569,6 +10570,7 @@
       <w:r>
         <w:rPr>
           <w:rFonts w:ascii="Arial" w:hAnsi="Arial" w:cs="Arial"/>
+          <w:noProof/>
         </w:rPr>
         <w:drawing>
           <wp:inline distT="0" distB="0" distL="0" distR="0" wp14:anchorId="0835F87B" wp14:editId="1AF7EC5B">
@@ -10680,6 +10682,7 @@
       <w:r>
         <w:rPr>
           <w:rFonts w:ascii="Arial" w:hAnsi="Arial" w:cs="Arial"/>
+          <w:noProof/>
         </w:rPr>
         <w:drawing>
           <wp:inline distT="0" distB="0" distL="0" distR="0" wp14:anchorId="42D7DDA3" wp14:editId="3C62B205">
@@ -10820,6 +10823,7 @@
           <w:rFonts w:ascii="Arial" w:hAnsi="Arial" w:cs="Arial"/>
           <w:b/>
           <w:bCs/>
+          <w:noProof/>
         </w:rPr>
         <w:lastRenderedPageBreak/>
         <w:drawing>
@@ -10915,6 +10919,7 @@
           <w:rFonts w:ascii="Arial" w:hAnsi="Arial" w:cs="Arial"/>
           <w:b/>
           <w:bCs/>
+          <w:noProof/>
         </w:rPr>
         <w:lastRenderedPageBreak/>
         <w:drawing>
@@ -11021,6 +11026,7 @@
           <w:rFonts w:ascii="Arial" w:hAnsi="Arial" w:cs="Arial"/>
           <w:b/>
           <w:bCs/>
+          <w:noProof/>
         </w:rPr>
         <w:lastRenderedPageBreak/>
         <w:drawing>
@@ -11209,6 +11215,7 @@
           <w:rFonts w:ascii="Arial" w:hAnsi="Arial" w:cs="Arial"/>
           <w:b/>
           <w:bCs/>
+          <w:noProof/>
         </w:rPr>
         <w:drawing>
           <wp:inline distT="0" distB="0" distL="0" distR="0" wp14:anchorId="7565FD51" wp14:editId="0681D6CD">
@@ -11281,6 +11288,7 @@
           <w:rFonts w:ascii="Arial" w:hAnsi="Arial" w:cs="Arial"/>
           <w:b/>
           <w:bCs/>
+          <w:noProof/>
         </w:rPr>
         <w:drawing>
           <wp:inline distT="0" distB="0" distL="0" distR="0" wp14:anchorId="688833E6" wp14:editId="3263D9B8">
@@ -11343,6 +11351,7 @@
           <w:rFonts w:ascii="Arial" w:hAnsi="Arial" w:cs="Arial"/>
           <w:b/>
           <w:bCs/>
+          <w:noProof/>
         </w:rPr>
         <w:drawing>
           <wp:inline distT="0" distB="0" distL="0" distR="0" wp14:anchorId="138B16E9" wp14:editId="65971EF5">
@@ -11444,6 +11453,7 @@
           <w:rFonts w:ascii="Arial" w:hAnsi="Arial" w:cs="Arial"/>
           <w:b/>
           <w:bCs/>
+          <w:noProof/>
         </w:rPr>
         <w:drawing>
           <wp:inline distT="0" distB="0" distL="0" distR="0" wp14:anchorId="7C99D9D7" wp14:editId="4095097B">
@@ -11516,6 +11526,7 @@
           <w:rFonts w:ascii="Arial" w:hAnsi="Arial" w:cs="Arial"/>
           <w:b/>
           <w:bCs/>
+          <w:noProof/>
         </w:rPr>
         <w:drawing>
           <wp:inline distT="0" distB="0" distL="0" distR="0" wp14:anchorId="3026C4A4" wp14:editId="55FAA3B2">
@@ -11578,6 +11589,7 @@
           <w:rFonts w:ascii="Arial" w:hAnsi="Arial" w:cs="Arial"/>
           <w:b/>
           <w:bCs/>
+          <w:noProof/>
         </w:rPr>
         <w:drawing>
           <wp:inline distT="0" distB="0" distL="0" distR="0" wp14:anchorId="0CE150C4" wp14:editId="77D357E7">
@@ -11668,6 +11680,7 @@
           <w:rFonts w:ascii="Arial" w:hAnsi="Arial" w:cs="Arial"/>
           <w:b/>
           <w:bCs/>
+          <w:noProof/>
         </w:rPr>
         <w:drawing>
           <wp:inline distT="0" distB="0" distL="0" distR="0" wp14:anchorId="39EE1D08" wp14:editId="3C90DEFD">
@@ -11747,6 +11760,7 @@
           <w:rFonts w:ascii="Arial" w:hAnsi="Arial" w:cs="Arial"/>
           <w:b/>
           <w:bCs/>
+          <w:noProof/>
         </w:rPr>
         <w:drawing>
           <wp:inline distT="0" distB="0" distL="0" distR="0" wp14:anchorId="39366154" wp14:editId="4DD69C26">
@@ -11869,6 +11883,7 @@
           <w:rFonts w:ascii="Arial" w:hAnsi="Arial" w:cs="Arial"/>
           <w:b/>
           <w:bCs/>
+          <w:noProof/>
           <w:sz w:val="16"/>
           <w:szCs w:val="16"/>
         </w:rPr>
@@ -11913,6 +11928,7 @@
           <w:rFonts w:ascii="Arial" w:hAnsi="Arial" w:cs="Arial"/>
           <w:b/>
           <w:bCs/>
+          <w:noProof/>
           <w:sz w:val="16"/>
           <w:szCs w:val="16"/>
         </w:rPr>
@@ -12002,6 +12018,7 @@
           <w:rFonts w:ascii="Arial" w:hAnsi="Arial" w:cs="Arial"/>
           <w:b/>
           <w:bCs/>
+          <w:noProof/>
           <w:sz w:val="16"/>
           <w:szCs w:val="16"/>
         </w:rPr>
@@ -12059,6 +12076,7 @@
           <w:rFonts w:ascii="Arial" w:hAnsi="Arial" w:cs="Arial"/>
           <w:b/>
           <w:bCs/>
+          <w:noProof/>
           <w:sz w:val="16"/>
           <w:szCs w:val="16"/>
         </w:rPr>
@@ -12148,6 +12166,7 @@
           <w:rFonts w:ascii="Arial" w:hAnsi="Arial" w:cs="Arial"/>
           <w:b/>
           <w:bCs/>
+          <w:noProof/>
           <w:sz w:val="16"/>
           <w:szCs w:val="16"/>
         </w:rPr>
@@ -12192,6 +12211,7 @@
           <w:rFonts w:ascii="Arial" w:hAnsi="Arial" w:cs="Arial"/>
           <w:b/>
           <w:bCs/>
+          <w:noProof/>
           <w:sz w:val="16"/>
           <w:szCs w:val="16"/>
         </w:rPr>
@@ -12294,6 +12314,7 @@
           <w:rFonts w:ascii="Arial" w:hAnsi="Arial" w:cs="Arial"/>
           <w:b/>
           <w:bCs/>
+          <w:noProof/>
           <w:sz w:val="16"/>
           <w:szCs w:val="16"/>
         </w:rPr>
@@ -12383,6 +12404,7 @@
           <w:rFonts w:ascii="Arial" w:hAnsi="Arial" w:cs="Arial"/>
           <w:b/>
           <w:bCs/>
+          <w:noProof/>
           <w:sz w:val="16"/>
           <w:szCs w:val="16"/>
         </w:rPr>
@@ -12427,6 +12449,7 @@
           <w:rFonts w:ascii="Arial" w:hAnsi="Arial" w:cs="Arial"/>
           <w:b/>
           <w:bCs/>
+          <w:noProof/>
           <w:sz w:val="16"/>
           <w:szCs w:val="16"/>
         </w:rPr>
@@ -12516,6 +12539,7 @@
           <w:rFonts w:ascii="Arial" w:hAnsi="Arial" w:cs="Arial"/>
           <w:b/>
           <w:bCs/>
+          <w:noProof/>
           <w:sz w:val="16"/>
           <w:szCs w:val="16"/>
         </w:rPr>
@@ -12560,6 +12584,7 @@
           <w:rFonts w:ascii="Arial" w:hAnsi="Arial" w:cs="Arial"/>
           <w:b/>
           <w:bCs/>
+          <w:noProof/>
           <w:sz w:val="16"/>
           <w:szCs w:val="16"/>
         </w:rPr>
@@ -12649,6 +12674,7 @@
           <w:rFonts w:ascii="Arial" w:hAnsi="Arial" w:cs="Arial"/>
           <w:b/>
           <w:bCs/>
+          <w:noProof/>
           <w:sz w:val="16"/>
           <w:szCs w:val="16"/>
         </w:rPr>
@@ -12693,6 +12719,7 @@
           <w:rFonts w:ascii="Arial" w:hAnsi="Arial" w:cs="Arial"/>
           <w:b/>
           <w:bCs/>
+          <w:noProof/>
           <w:sz w:val="16"/>
           <w:szCs w:val="16"/>
         </w:rPr>
@@ -12784,6 +12811,7 @@
           <w:rFonts w:ascii="Arial" w:hAnsi="Arial" w:cs="Arial"/>
           <w:b/>
           <w:bCs/>
+          <w:noProof/>
           <w:sz w:val="16"/>
           <w:szCs w:val="16"/>
         </w:rPr>
@@ -12828,6 +12856,7 @@
           <w:rFonts w:ascii="Arial" w:hAnsi="Arial" w:cs="Arial"/>
           <w:b/>
           <w:bCs/>
+          <w:noProof/>
           <w:sz w:val="16"/>
           <w:szCs w:val="16"/>
         </w:rPr>
@@ -12896,6 +12925,7 @@
           <w:rFonts w:ascii="Arial" w:hAnsi="Arial" w:cs="Arial"/>
           <w:b/>
           <w:bCs/>
+          <w:noProof/>
           <w:sz w:val="16"/>
           <w:szCs w:val="16"/>
         </w:rPr>
@@ -12940,6 +12970,7 @@
           <w:rFonts w:ascii="Arial" w:hAnsi="Arial" w:cs="Arial"/>
           <w:b/>
           <w:bCs/>
+          <w:noProof/>
           <w:sz w:val="16"/>
           <w:szCs w:val="16"/>
         </w:rPr>
@@ -13008,6 +13039,7 @@
           <w:rFonts w:ascii="Arial" w:hAnsi="Arial" w:cs="Arial"/>
           <w:b/>
           <w:bCs/>
+          <w:noProof/>
           <w:sz w:val="16"/>
           <w:szCs w:val="16"/>
         </w:rPr>
@@ -13065,6 +13097,7 @@
           <w:rFonts w:ascii="Arial" w:hAnsi="Arial" w:cs="Arial"/>
           <w:b/>
           <w:bCs/>
+          <w:noProof/>
           <w:sz w:val="16"/>
           <w:szCs w:val="16"/>
         </w:rPr>
@@ -13146,6 +13179,7 @@
           <w:rFonts w:ascii="Arial" w:hAnsi="Arial" w:cs="Arial"/>
           <w:b/>
           <w:bCs/>
+          <w:noProof/>
           <w:sz w:val="16"/>
           <w:szCs w:val="16"/>
         </w:rPr>
@@ -13190,6 +13224,7 @@
           <w:rFonts w:ascii="Arial" w:hAnsi="Arial" w:cs="Arial"/>
           <w:b/>
           <w:bCs/>
+          <w:noProof/>
           <w:sz w:val="16"/>
           <w:szCs w:val="16"/>
         </w:rPr>
@@ -13364,6 +13399,7 @@
           <w:rFonts w:ascii="Arial" w:hAnsi="Arial" w:cs="Arial"/>
           <w:b/>
           <w:bCs/>
+          <w:noProof/>
           <w:sz w:val="16"/>
           <w:szCs w:val="16"/>
         </w:rPr>
@@ -13408,6 +13444,7 @@
           <w:rFonts w:ascii="Arial" w:hAnsi="Arial" w:cs="Arial"/>
           <w:b/>
           <w:bCs/>
+          <w:noProof/>
           <w:sz w:val="16"/>
           <w:szCs w:val="16"/>
         </w:rPr>
@@ -13452,6 +13489,7 @@
           <w:rFonts w:ascii="Arial" w:hAnsi="Arial" w:cs="Arial"/>
           <w:b/>
           <w:bCs/>
+          <w:noProof/>
           <w:sz w:val="16"/>
           <w:szCs w:val="16"/>
         </w:rPr>
@@ -13497,6 +13535,7 @@
           <w:rFonts w:ascii="Arial" w:hAnsi="Arial" w:cs="Arial"/>
           <w:b/>
           <w:bCs/>
+          <w:noProof/>
           <w:sz w:val="16"/>
           <w:szCs w:val="16"/>
         </w:rPr>
@@ -13541,6 +13580,7 @@
           <w:rFonts w:ascii="Arial" w:hAnsi="Arial" w:cs="Arial"/>
           <w:b/>
           <w:bCs/>
+          <w:noProof/>
           <w:sz w:val="16"/>
           <w:szCs w:val="16"/>
         </w:rPr>
@@ -13586,6 +13626,7 @@
           <w:rFonts w:ascii="Arial" w:hAnsi="Arial" w:cs="Arial"/>
           <w:b/>
           <w:bCs/>
+          <w:noProof/>
           <w:sz w:val="16"/>
           <w:szCs w:val="16"/>
         </w:rPr>
@@ -13630,6 +13671,7 @@
           <w:rFonts w:ascii="Arial" w:hAnsi="Arial" w:cs="Arial"/>
           <w:b/>
           <w:bCs/>
+          <w:noProof/>
           <w:sz w:val="16"/>
           <w:szCs w:val="16"/>
         </w:rPr>
@@ -13675,6 +13717,7 @@
           <w:rFonts w:ascii="Arial" w:hAnsi="Arial" w:cs="Arial"/>
           <w:b/>
           <w:bCs/>
+          <w:noProof/>
           <w:sz w:val="16"/>
           <w:szCs w:val="16"/>
         </w:rPr>
@@ -13719,6 +13762,7 @@
           <w:rFonts w:ascii="Arial" w:hAnsi="Arial" w:cs="Arial"/>
           <w:b/>
           <w:bCs/>
+          <w:noProof/>
           <w:sz w:val="16"/>
           <w:szCs w:val="16"/>
         </w:rPr>
@@ -13777,6 +13821,7 @@
           <w:rFonts w:ascii="Arial" w:hAnsi="Arial" w:cs="Arial"/>
           <w:b/>
           <w:bCs/>
+          <w:noProof/>
           <w:sz w:val="16"/>
           <w:szCs w:val="16"/>
         </w:rPr>
@@ -13827,6 +13872,433 @@
           <w:bCs/>
           <w:sz w:val="16"/>
           <w:szCs w:val="16"/>
+        </w:rPr>
+      </w:pPr>
+      <w:r>
+        <w:rPr>
+          <w:rFonts w:ascii="Arial" w:hAnsi="Arial" w:cs="Arial"/>
+          <w:b/>
+          <w:bCs/>
+          <w:sz w:val="16"/>
+          <w:szCs w:val="16"/>
+        </w:rPr>
+        <w:lastRenderedPageBreak/>
+        <w:t xml:space="preserve">A continuación se muestra el modelo ERR final para mejor comprensión </w:t>
+      </w:r>
+      <w:proofErr w:type="spellStart"/>
+      <w:r>
+        <w:rPr>
+          <w:rFonts w:ascii="Arial" w:hAnsi="Arial" w:cs="Arial"/>
+          <w:b/>
+          <w:bCs/>
+          <w:sz w:val="16"/>
+          <w:szCs w:val="16"/>
+        </w:rPr>
+        <w:t>de el</w:t>
+      </w:r>
+      <w:proofErr w:type="spellEnd"/>
+      <w:r>
+        <w:rPr>
+          <w:rFonts w:ascii="Arial" w:hAnsi="Arial" w:cs="Arial"/>
+          <w:b/>
+          <w:bCs/>
+          <w:sz w:val="16"/>
+          <w:szCs w:val="16"/>
+        </w:rPr>
+        <w:t xml:space="preserve"> modelo MVC+DAO :</w:t>
+      </w:r>
+    </w:p>
+    <w:p>
+      <w:pPr>
+        <w:spacing w:after="0"/>
+        <w:jc w:val="both"/>
+        <w:rPr>
+          <w:rFonts w:ascii="Arial" w:hAnsi="Arial" w:cs="Arial"/>
+          <w:b/>
+          <w:bCs/>
+          <w:sz w:val="16"/>
+          <w:szCs w:val="16"/>
+        </w:rPr>
+      </w:pPr>
+      <w:r>
+        <w:rPr>
+          <w:noProof/>
+        </w:rPr>
+        <w:drawing>
+          <wp:inline distT="0" distB="0" distL="0" distR="0" wp14:anchorId="7CD2BEFF" wp14:editId="734C5BDE">
+            <wp:extent cx="5612130" cy="4281805"/>
+            <wp:effectExtent l="0" t="0" r="7620" b="4445"/>
+            <wp:docPr id="1143518170" name="Imagen 1"/>
+            <wp:cNvGraphicFramePr>
+              <a:graphicFrameLocks xmlns:a="http://schemas.openxmlformats.org/drawingml/2006/main" noChangeAspect="1"/>
+            </wp:cNvGraphicFramePr>
+            <a:graphic xmlns:a="http://schemas.openxmlformats.org/drawingml/2006/main">
+              <a:graphicData uri="http://schemas.openxmlformats.org/drawingml/2006/picture">
+                <pic:pic xmlns:pic="http://schemas.openxmlformats.org/drawingml/2006/picture">
+                  <pic:nvPicPr>
+                    <pic:cNvPr id="0" name="Picture 1"/>
+                    <pic:cNvPicPr>
+                      <a:picLocks noChangeAspect="1" noChangeArrowheads="1"/>
+                    </pic:cNvPicPr>
+                  </pic:nvPicPr>
+                  <pic:blipFill>
+                    <a:blip r:embed="rId50">
+                      <a:extLst>
+                        <a:ext uri="{28A0092B-C50C-407E-A947-70E740481C1C}">
+                          <a14:useLocalDpi xmlns:a14="http://schemas.microsoft.com/office/drawing/2010/main" val="0"/>
+                        </a:ext>
+                      </a:extLst>
+                    </a:blip>
+                    <a:srcRect/>
+                    <a:stretch>
+                      <a:fillRect/>
+                    </a:stretch>
+                  </pic:blipFill>
+                  <pic:spPr bwMode="auto">
+                    <a:xfrm>
+                      <a:off x="0" y="0"/>
+                      <a:ext cx="5612130" cy="4281805"/>
+                    </a:xfrm>
+                    <a:prstGeom prst="rect">
+                      <a:avLst/>
+                    </a:prstGeom>
+                    <a:noFill/>
+                    <a:ln>
+                      <a:noFill/>
+                    </a:ln>
+                  </pic:spPr>
+                </pic:pic>
+              </a:graphicData>
+            </a:graphic>
+          </wp:inline>
+        </w:drawing>
+      </w:r>
+    </w:p>
+    <w:p>
+      <w:pPr>
+        <w:spacing w:after="0"/>
+        <w:jc w:val="both"/>
+        <w:rPr>
+          <w:rFonts w:ascii="Arial" w:hAnsi="Arial" w:cs="Arial"/>
+          <w:b/>
+          <w:bCs/>
+          <w:sz w:val="16"/>
+          <w:szCs w:val="16"/>
+        </w:rPr>
+      </w:pPr>
+    </w:p>
+    <w:p>
+      <w:pPr>
+        <w:spacing w:after="0"/>
+        <w:jc w:val="both"/>
+        <w:rPr>
+          <w:rFonts w:ascii="Arial" w:hAnsi="Arial" w:cs="Arial"/>
+          <w:b/>
+          <w:bCs/>
+          <w:sz w:val="24"/>
+          <w:szCs w:val="24"/>
+        </w:rPr>
+      </w:pPr>
+      <w:r>
+        <w:rPr>
+          <w:rFonts w:ascii="Arial" w:hAnsi="Arial" w:cs="Arial"/>
+          <w:b/>
+          <w:bCs/>
+          <w:sz w:val="24"/>
+          <w:szCs w:val="24"/>
+        </w:rPr>
+        <w:t>Por ultimo adjunto enlace de r</w:t>
+      </w:r>
+      <w:r>
+        <w:rPr>
+          <w:rFonts w:ascii="Arial" w:hAnsi="Arial" w:cs="Arial"/>
+          <w:b/>
+          <w:bCs/>
+          <w:sz w:val="24"/>
+          <w:szCs w:val="24"/>
+        </w:rPr>
+        <w:t>epositorio Git con scripts SQL y código Java</w:t>
+      </w:r>
+    </w:p>
+    <w:p>
+      <w:pPr>
+        <w:spacing w:after="0"/>
+        <w:jc w:val="both"/>
+        <w:rPr>
+          <w:rFonts w:ascii="Arial" w:hAnsi="Arial" w:cs="Arial"/>
+          <w:b/>
+          <w:bCs/>
+          <w:sz w:val="24"/>
+          <w:szCs w:val="24"/>
+        </w:rPr>
+      </w:pPr>
+    </w:p>
+    <w:p>
+      <w:pPr>
+        <w:spacing w:after="0"/>
+        <w:jc w:val="both"/>
+        <w:rPr>
+          <w:rFonts w:ascii="Arial" w:hAnsi="Arial" w:cs="Arial"/>
+          <w:b/>
+          <w:bCs/>
+          <w:sz w:val="24"/>
+          <w:szCs w:val="24"/>
+          <w:lang w:val="en-US"/>
+        </w:rPr>
+      </w:pPr>
+      <w:r>
+        <w:rPr>
+          <w:rFonts w:ascii="Arial" w:hAnsi="Arial" w:cs="Arial"/>
+          <w:b/>
+          <w:bCs/>
+          <w:sz w:val="24"/>
+          <w:szCs w:val="24"/>
+          <w:lang w:val="en-US"/>
+        </w:rPr>
+        <w:t xml:space="preserve">Cloar repositorio (Git </w:t>
+      </w:r>
+      <w:r>
+        <w:rPr>
+          <w:rFonts w:ascii="Arial" w:hAnsi="Arial" w:cs="Arial"/>
+          <w:b/>
+          <w:bCs/>
+          <w:sz w:val="24"/>
+          <w:szCs w:val="24"/>
+          <w:lang w:val="en-US"/>
+        </w:rPr>
+        <w:t>Bash</w:t>
+      </w:r>
+      <w:r>
+        <w:rPr>
+          <w:rFonts w:ascii="Arial" w:hAnsi="Arial" w:cs="Arial"/>
+          <w:b/>
+          <w:bCs/>
+          <w:sz w:val="24"/>
+          <w:szCs w:val="24"/>
+          <w:lang w:val="en-US"/>
+        </w:rPr>
+        <w:t>)</w:t>
+      </w:r>
+    </w:p>
+    <w:p>
+      <w:pPr>
+        <w:spacing w:after="0"/>
+        <w:jc w:val="both"/>
+        <w:rPr>
+          <w:rFonts w:ascii="Arial" w:hAnsi="Arial" w:cs="Arial"/>
+          <w:b/>
+          <w:bCs/>
+          <w:sz w:val="20"/>
+          <w:szCs w:val="20"/>
+          <w:lang w:val="en-US"/>
+        </w:rPr>
+      </w:pPr>
+      <w:r>
+        <w:rPr>
+          <w:rFonts w:ascii="Arial" w:hAnsi="Arial" w:cs="Arial"/>
+          <w:b/>
+          <w:bCs/>
+          <w:sz w:val="20"/>
+          <w:szCs w:val="20"/>
+          <w:lang w:val="en-US"/>
+        </w:rPr>
+        <w:t>git init</w:t>
+      </w:r>
+    </w:p>
+    <w:p>
+      <w:pPr>
+        <w:spacing w:after="0"/>
+        <w:jc w:val="both"/>
+        <w:rPr>
+          <w:rFonts w:ascii="Arial" w:hAnsi="Arial" w:cs="Arial"/>
+          <w:b/>
+          <w:bCs/>
+          <w:sz w:val="20"/>
+          <w:szCs w:val="20"/>
+          <w:lang w:val="en-US"/>
+        </w:rPr>
+      </w:pPr>
+      <w:r>
+        <w:rPr>
+          <w:rFonts w:ascii="Arial" w:hAnsi="Arial" w:cs="Arial"/>
+          <w:b/>
+          <w:bCs/>
+          <w:sz w:val="20"/>
+          <w:szCs w:val="20"/>
+          <w:lang w:val="en-US"/>
+        </w:rPr>
+        <w:t xml:space="preserve">git clone </w:t>
+      </w:r>
+      <w:hyperlink r:id="rId51" w:history="1">
+        <w:r>
+          <w:rPr>
+            <w:rStyle w:val="Hipervnculo"/>
+            <w:rFonts w:ascii="Arial" w:hAnsi="Arial" w:cs="Arial"/>
+            <w:b/>
+            <w:bCs/>
+            <w:sz w:val="20"/>
+            <w:szCs w:val="20"/>
+            <w:lang w:val="en-US"/>
+          </w:rPr>
+          <w:t>https://github.com/zorroedward0/Eviden</w:t>
+        </w:r>
+        <w:r>
+          <w:rPr>
+            <w:rStyle w:val="Hipervnculo"/>
+            <w:rFonts w:ascii="Arial" w:hAnsi="Arial" w:cs="Arial"/>
+            <w:b/>
+            <w:bCs/>
+            <w:sz w:val="20"/>
+            <w:szCs w:val="20"/>
+            <w:lang w:val="en-US"/>
+          </w:rPr>
+          <w:t>c</w:t>
+        </w:r>
+        <w:r>
+          <w:rPr>
+            <w:rStyle w:val="Hipervnculo"/>
+            <w:rFonts w:ascii="Arial" w:hAnsi="Arial" w:cs="Arial"/>
+            <w:b/>
+            <w:bCs/>
+            <w:sz w:val="20"/>
+            <w:szCs w:val="20"/>
+            <w:lang w:val="en-US"/>
+          </w:rPr>
+          <w:t>ias.git</w:t>
+        </w:r>
+      </w:hyperlink>
+    </w:p>
+    <w:p>
+      <w:pPr>
+        <w:spacing w:after="0"/>
+        <w:jc w:val="both"/>
+        <w:rPr>
+          <w:rFonts w:ascii="Arial" w:hAnsi="Arial" w:cs="Arial"/>
+          <w:b/>
+          <w:bCs/>
+          <w:sz w:val="20"/>
+          <w:szCs w:val="20"/>
+          <w:lang w:val="en-US"/>
+        </w:rPr>
+      </w:pPr>
+    </w:p>
+    <w:p>
+      <w:pPr>
+        <w:spacing w:after="0"/>
+        <w:jc w:val="both"/>
+        <w:rPr>
+          <w:rFonts w:ascii="Arial" w:hAnsi="Arial" w:cs="Arial"/>
+          <w:b/>
+          <w:bCs/>
+          <w:sz w:val="20"/>
+          <w:szCs w:val="20"/>
+          <w:lang w:val="en-US"/>
+        </w:rPr>
+      </w:pPr>
+      <w:r>
+        <w:rPr>
+          <w:rFonts w:ascii="Arial" w:hAnsi="Arial" w:cs="Arial"/>
+          <w:b/>
+          <w:bCs/>
+          <w:sz w:val="20"/>
+          <w:szCs w:val="20"/>
+          <w:lang w:val="en-US"/>
+        </w:rPr>
+        <w:t xml:space="preserve">Enlace Directo </w:t>
+      </w:r>
+    </w:p>
+    <w:p>
+      <w:pPr>
+        <w:spacing w:after="0"/>
+        <w:jc w:val="both"/>
+        <w:rPr>
+          <w:rFonts w:ascii="Arial" w:hAnsi="Arial" w:cs="Arial"/>
+          <w:b/>
+          <w:bCs/>
+          <w:sz w:val="20"/>
+          <w:szCs w:val="20"/>
+          <w:lang w:val="en-US"/>
+        </w:rPr>
+      </w:pPr>
+      <w:hyperlink r:id="rId52" w:history="1">
+        <w:r>
+          <w:rPr>
+            <w:rStyle w:val="Hipervnculo"/>
+            <w:rFonts w:ascii="Arial" w:hAnsi="Arial" w:cs="Arial"/>
+            <w:b/>
+            <w:bCs/>
+            <w:sz w:val="20"/>
+            <w:szCs w:val="20"/>
+            <w:lang w:val="en-US"/>
+          </w:rPr>
+          <w:t>https://github.com/zorroedward0/Evidencias.git</w:t>
+        </w:r>
+      </w:hyperlink>
+    </w:p>
+    <w:p>
+      <w:pPr>
+        <w:spacing w:after="0"/>
+        <w:jc w:val="both"/>
+        <w:rPr>
+          <w:rFonts w:ascii="Arial" w:hAnsi="Arial" w:cs="Arial"/>
+          <w:b/>
+          <w:bCs/>
+          <w:sz w:val="20"/>
+          <w:szCs w:val="20"/>
+          <w:lang w:val="en-US"/>
+        </w:rPr>
+      </w:pPr>
+    </w:p>
+    <w:p>
+      <w:pPr>
+        <w:spacing w:after="0"/>
+        <w:jc w:val="both"/>
+        <w:rPr>
+          <w:rFonts w:ascii="Arial" w:hAnsi="Arial" w:cs="Arial"/>
+          <w:b/>
+          <w:bCs/>
+          <w:sz w:val="20"/>
+          <w:szCs w:val="20"/>
+          <w:lang w:val="en-US"/>
+        </w:rPr>
+      </w:pPr>
+      <w:r>
+        <w:rPr>
+          <w:rFonts w:ascii="Arial" w:hAnsi="Arial" w:cs="Arial"/>
+          <w:b/>
+          <w:bCs/>
+          <w:sz w:val="20"/>
+          <w:szCs w:val="20"/>
+          <w:lang w:val="en-US"/>
+        </w:rPr>
+        <w:t>¡Gracias por leer!</w:t>
+      </w:r>
+    </w:p>
+    <w:p>
+      <w:pPr>
+        <w:spacing w:after="0"/>
+        <w:jc w:val="both"/>
+        <w:rPr>
+          <w:rFonts w:ascii="Arial" w:hAnsi="Arial" w:cs="Arial"/>
+          <w:b/>
+          <w:bCs/>
+          <w:sz w:val="20"/>
+          <w:szCs w:val="20"/>
+          <w:lang w:val="en-US"/>
+        </w:rPr>
+      </w:pPr>
+    </w:p>
+    <w:p>
+      <w:pPr>
+        <w:spacing w:after="0"/>
+        <w:jc w:val="both"/>
+        <w:rPr>
+          <w:rFonts w:ascii="Arial" w:hAnsi="Arial" w:cs="Arial"/>
+          <w:b/>
+          <w:bCs/>
+          <w:sz w:val="16"/>
+          <w:szCs w:val="16"/>
+          <w:lang w:val="en-US"/>
         </w:rPr>
       </w:pPr>
     </w:p>
@@ -14757,6 +15229,41 @@
       <w:spacing w:val="5"/>
     </w:rPr>
   </w:style>
+  <w:style w:type="character" w:styleId="Hipervnculo">
+    <w:name w:val="Hyperlink"/>
+    <w:basedOn w:val="Fuentedeprrafopredeter"/>
+    <w:uiPriority w:val="99"/>
+    <w:unhideWhenUsed/>
+    <w:rsid w:val="00C7623E"/>
+    <w:rPr>
+      <w:color w:val="467886" w:themeColor="hyperlink"/>
+      <w:u w:val="single"/>
+    </w:rPr>
+  </w:style>
+  <w:style w:type="character" w:styleId="Mencinsinresolver">
+    <w:name w:val="Unresolved Mention"/>
+    <w:basedOn w:val="Fuentedeprrafopredeter"/>
+    <w:uiPriority w:val="99"/>
+    <w:semiHidden/>
+    <w:unhideWhenUsed/>
+    <w:rsid w:val="00C7623E"/>
+    <w:rPr>
+      <w:color w:val="605E5C"/>
+      <w:shd w:val="clear" w:color="auto" w:fill="E1DFDD"/>
+    </w:rPr>
+  </w:style>
+  <w:style w:type="character" w:styleId="Hipervnculovisitado">
+    <w:name w:val="FollowedHyperlink"/>
+    <w:basedOn w:val="Fuentedeprrafopredeter"/>
+    <w:uiPriority w:val="99"/>
+    <w:semiHidden/>
+    <w:unhideWhenUsed/>
+    <w:rsid w:val="00C7623E"/>
+    <w:rPr>
+      <w:color w:val="96607D" w:themeColor="followedHyperlink"/>
+      <w:u w:val="single"/>
+    </w:rPr>
+  </w:style>
 </w:styles>
 </file>
 

</xml_diff>